<commit_message>
update report - related works - VAE - GAN
</commit_message>
<xml_diff>
--- a/writings/Exploring Text-to-Images Generators for Medical Cases Visualization.docx
+++ b/writings/Exploring Text-to-Images Generators for Medical Cases Visualization.docx
@@ -1526,42 +1526,95 @@
     <w:p>
       <w:pPr>
         <w:pStyle w:val="BodyText"/>
-      </w:pPr>
-      <w:r>
-        <w:t xml:space="preserve">First, confirm that you have the correct template for your paper size. This template has been tailored for output on the </w:t>
-      </w:r>
-      <w:r>
-        <w:rPr>
-          <w:lang w:val="en-US"/>
-        </w:rPr>
-        <w:t>A4</w:t>
-      </w:r>
-      <w:r>
-        <w:t xml:space="preserve"> paper size. If you are using </w:t>
-      </w:r>
-      <w:r>
-        <w:rPr>
-          <w:lang w:val="en-US"/>
-        </w:rPr>
-        <w:t>US letter</w:t>
-      </w:r>
-      <w:r>
-        <w:t>-sized paper, please close this</w:t>
-      </w:r>
-      <w:r>
-        <w:t xml:space="preserve"> file and download the </w:t>
-      </w:r>
-      <w:r>
-        <w:rPr>
-          <w:lang w:val="en-US"/>
-        </w:rPr>
-        <w:t xml:space="preserve">Microsoft Word, Letter </w:t>
-      </w:r>
-      <w:r>
-        <w:t>file</w:t>
-      </w:r>
-      <w:r>
-        <w:t>.</w:t>
+        <w:rPr>
+          <w:rFonts w:hint="eastAsia"/>
+          <w:lang w:eastAsia="zh-CN"/>
+        </w:rPr>
+      </w:pPr>
+      <w:r>
+        <w:rPr>
+          <w:rFonts w:hint="eastAsia"/>
+          <w:lang w:eastAsia="zh-CN"/>
+        </w:rPr>
+        <w:t xml:space="preserve">Variational Autoencoder (VAE), Generative Adversarial Networks (GAN), and Diffusion are the mainstream generative model architectures. </w:t>
+      </w:r>
+      <w:r>
+        <w:rPr>
+          <w:lang w:eastAsia="zh-CN"/>
+        </w:rPr>
+        <w:t xml:space="preserve">[1] provides an introduction to the vanilla VAE architecture, including its optimization objectives. [4] proposed a deep hierarchy VAE with residual </w:t>
+      </w:r>
+      <w:r>
+        <w:rPr>
+          <w:lang w:eastAsia="zh-CN"/>
+        </w:rPr>
+        <w:t>cells applied to both encoder and decoder, and it utilized spectral regularization to stabilize the model training.</w:t>
+      </w:r>
+      <w:r>
+        <w:rPr>
+          <w:lang w:eastAsia="zh-CN"/>
+        </w:rPr>
+        <w:t xml:space="preserve"> Inspired by control systems, [3] proposed ControlVAE to address the KL-divergence vanishing problem. It leveraged the feedback value from the objective function to dynamically calculate the coefficient of the KL term. Another variation of VAE is MEME introduced by [2], and this altered VAE mainly served the purpose of representation learning in multi-modal cases.</w:t>
+      </w:r>
+      <w:r>
+        <w:rPr>
+          <w:lang w:eastAsia="zh-CN"/>
+        </w:rPr>
+        <w:t xml:space="preserve"> For the other architecture GAN, [10] proposed a deep convolutional variant, without using any fully connected or pooling layers as has been done in some of its predecessors. The deep convolutional GAN proposed by [11] is the first GAN-based work for text-to-image synthesis. The idea that adds the (real image, mismatch text) pair to the discriminator’s input becomes a common training technique for conditional GANs.</w:t>
+      </w:r>
+      <w:r>
+        <w:rPr>
+          <w:lang w:eastAsia="zh-CN"/>
+        </w:rPr>
+        <w:t xml:space="preserve"> [5] employed context conditions to the GAN by masking a region in the image. To mitigate the model collapse issue, [6] implemented a Multi-Agent Diverse GAN. It contains multiple generators while keeping only one discriminator.[9] proposed an architecture that could generate a new </w:t>
+      </w:r>
+      <w:r>
+        <w:rPr>
+          <w:lang w:eastAsia="zh-CN"/>
+        </w:rPr>
+        <w:t>object</w:t>
+      </w:r>
+      <w:r>
+        <w:rPr>
+          <w:lang w:eastAsia="zh-CN"/>
+        </w:rPr>
+        <w:t xml:space="preserve"> from a text prompt</w:t>
+      </w:r>
+      <w:r>
+        <w:rPr>
+          <w:lang w:eastAsia="zh-CN"/>
+        </w:rPr>
+        <w:t xml:space="preserve"> </w:t>
+      </w:r>
+      <w:r>
+        <w:rPr>
+          <w:lang w:eastAsia="zh-CN"/>
+        </w:rPr>
+        <w:t>and merge with</w:t>
+      </w:r>
+      <w:r>
+        <w:rPr>
+          <w:lang w:eastAsia="zh-CN"/>
+        </w:rPr>
+        <w:t xml:space="preserve"> a given background image.</w:t>
+      </w:r>
+      <w:r>
+        <w:rPr>
+          <w:lang w:eastAsia="zh-CN"/>
+        </w:rPr>
+        <w:t xml:space="preserve"> The altered GAN in [7] used a mapping network to project the latent features to an intermediate space, and then broadcast to the synthesis network as style features. Another text-to-image work[8] exploited the attention mechanism, implemented multi-stage generators and word-level discriminators.</w:t>
+      </w:r>
+      <w:r>
+        <w:rPr>
+          <w:lang w:eastAsia="zh-CN"/>
+        </w:rPr>
+        <w:t xml:space="preserve"> [12] Introduced the U-Net structure to the discriminator</w:t>
+      </w:r>
+      <w:r>
+        <w:rPr>
+          <w:lang w:eastAsia="zh-CN"/>
+        </w:rPr>
+        <w:t>. This helped in predicting both the per-pixel and per-image decision of the image belonging to the real or the fake class. It generated improved measurement scores across datasets.</w:t>
       </w:r>
     </w:p>
     <w:p>
@@ -1616,6 +1669,7 @@
         </w:tabs>
       </w:pPr>
       <w:r>
+        <w:lastRenderedPageBreak/>
         <w:t>Applications and Ethics</w:t>
       </w:r>
     </w:p>
@@ -1682,15 +1736,7 @@
         <w:pStyle w:val="BodyText"/>
       </w:pPr>
       <w:r>
-        <w:t xml:space="preserve">Define abbreviations and acronyms the first time they are used in the text, even after they have been defined in the abstract. Abbreviations such as IEEE, SI, MKS, CGS, </w:t>
-      </w:r>
-      <w:proofErr w:type="spellStart"/>
-      <w:r>
-        <w:t>sc</w:t>
-      </w:r>
-      <w:proofErr w:type="spellEnd"/>
-      <w:r>
-        <w:t>, dc, and rms do not have to be defined. Do not use abbreviations in the title or heads unless they are unavoidable.</w:t>
+        <w:t>Define abbreviations and acronyms the first time they are used in the text, even after they have been defined in the abstract. Abbreviations such as IEEE, SI, MKS, CGS, sc, dc, and rms do not have to be defined. Do not use abbreviations in the title or heads unless they are unavoidable.</w:t>
       </w:r>
     </w:p>
     <w:p>
@@ -1728,7 +1774,6 @@
         <w:rPr>
           <w:noProof/>
         </w:rPr>
-        <w:lastRenderedPageBreak/>
         <w:drawing>
           <wp:anchor distT="0" distB="0" distL="114300" distR="114300" simplePos="0" relativeHeight="251656703" behindDoc="0" locked="0" layoutInCell="1" allowOverlap="1" wp14:anchorId="2CA6103B" wp14:editId="0C93EDED">
             <wp:simplePos x="574964" y="1004455"/>
@@ -1873,21 +1918,67 @@
                               <w:pPr>
                                 <w:pStyle w:val="tablecopy"/>
                                 <w:rPr>
-                                  <w:rFonts w:hint="eastAsia"/>
                                   <w:sz w:val="8"/>
                                   <w:szCs w:val="8"/>
                                   <w:lang w:eastAsia="zh-CN"/>
                                 </w:rPr>
                               </w:pPr>
                               <w:r>
-                                <w:t>VAE[1]–[5] GAN[6]-[21] Diffusion</w:t>
+                                <w:t>VAE[1]–[</w:t>
+                              </w:r>
+                              <w:r>
+                                <w:t>4</w:t>
+                              </w:r>
+                              <w:r>
+                                <w:t>] GAN[</w:t>
+                              </w:r>
+                              <w:r>
+                                <w:t>5</w:t>
+                              </w:r>
+                              <w:r>
+                                <w:t>]-[</w:t>
+                              </w:r>
+                              <w:r>
+                                <w:t>1</w:t>
+                              </w:r>
+                              <w:r>
+                                <w:t>8</w:t>
+                              </w:r>
+                              <w:r>
+                                <w:t>] Diffusion</w:t>
                               </w:r>
                               <w:r>
                                 <w:rPr>
                                   <w:rFonts w:hint="eastAsia"/>
                                   <w:lang w:eastAsia="zh-CN"/>
                                 </w:rPr>
-                                <w:t>[22]-[37]</w:t>
+                                <w:t>[</w:t>
+                              </w:r>
+                              <w:r>
+                                <w:rPr>
+                                  <w:lang w:eastAsia="zh-CN"/>
+                                </w:rPr>
+                                <w:t>19</w:t>
+                              </w:r>
+                              <w:r>
+                                <w:rPr>
+                                  <w:rFonts w:hint="eastAsia"/>
+                                  <w:lang w:eastAsia="zh-CN"/>
+                                </w:rPr>
+                                <w:t>]-[3</w:t>
+                              </w:r>
+                              <w:r>
+                                <w:rPr>
+                                  <w:lang w:eastAsia="zh-CN"/>
+                                </w:rPr>
+                                <w:t>4</w:t>
+                              </w:r>
+                              <w:r>
+                                <w:rPr>
+                                  <w:rFonts w:hint="eastAsia"/>
+                                  <w:lang w:eastAsia="zh-CN"/>
+                                </w:rPr>
+                                <w:t>]</w:t>
                               </w:r>
                             </w:p>
                           </w:tc>
@@ -1899,7 +1990,6 @@
                               <w:pPr>
                                 <w:pStyle w:val="tablecopy"/>
                                 <w:rPr>
-                                  <w:rFonts w:hint="eastAsia"/>
                                   <w:lang w:eastAsia="zh-CN"/>
                                 </w:rPr>
                               </w:pPr>
@@ -1908,7 +1998,78 @@
                                   <w:rFonts w:hint="eastAsia"/>
                                   <w:lang w:eastAsia="zh-CN"/>
                                 </w:rPr>
-                                <w:t>[2],[25],[29],[31],[38]-[49]</w:t>
+                                <w:t>[2],[2</w:t>
+                              </w:r>
+                              <w:r>
+                                <w:rPr>
+                                  <w:lang w:eastAsia="zh-CN"/>
+                                </w:rPr>
+                                <w:t>2</w:t>
+                              </w:r>
+                              <w:r>
+                                <w:rPr>
+                                  <w:rFonts w:hint="eastAsia"/>
+                                  <w:lang w:eastAsia="zh-CN"/>
+                                </w:rPr>
+                                <w:t>],[2</w:t>
+                              </w:r>
+                              <w:r>
+                                <w:rPr>
+                                  <w:lang w:eastAsia="zh-CN"/>
+                                </w:rPr>
+                                <w:t>6</w:t>
+                              </w:r>
+                              <w:r>
+                                <w:rPr>
+                                  <w:rFonts w:hint="eastAsia"/>
+                                  <w:lang w:eastAsia="zh-CN"/>
+                                </w:rPr>
+                                <w:t>],[</w:t>
+                              </w:r>
+                              <w:r>
+                                <w:rPr>
+                                  <w:lang w:eastAsia="zh-CN"/>
+                                </w:rPr>
+                                <w:t>2</w:t>
+                              </w:r>
+                              <w:r>
+                                <w:rPr>
+                                  <w:lang w:eastAsia="zh-CN"/>
+                                </w:rPr>
+                                <w:t>8</w:t>
+                              </w:r>
+                              <w:r>
+                                <w:rPr>
+                                  <w:rFonts w:hint="eastAsia"/>
+                                  <w:lang w:eastAsia="zh-CN"/>
+                                </w:rPr>
+                                <w:t>],[3</w:t>
+                              </w:r>
+                              <w:r>
+                                <w:rPr>
+                                  <w:lang w:eastAsia="zh-CN"/>
+                                </w:rPr>
+                                <w:t>5</w:t>
+                              </w:r>
+                              <w:r>
+                                <w:rPr>
+                                  <w:rFonts w:hint="eastAsia"/>
+                                  <w:lang w:eastAsia="zh-CN"/>
+                                </w:rPr>
+                                <w:t>]-[4</w:t>
+                              </w:r>
+                              <w:r>
+                                <w:rPr>
+                                  <w:lang w:eastAsia="zh-CN"/>
+                                </w:rPr>
+                                <w:t>6</w:t>
+                              </w:r>
+                              <w:r>
+                                <w:rPr>
+                                  <w:rFonts w:hint="eastAsia"/>
+                                  <w:lang w:eastAsia="zh-CN"/>
+                                </w:rPr>
+                                <w:t>]</w:t>
                               </w:r>
                             </w:p>
                           </w:tc>
@@ -1922,7 +2083,22 @@
                                 <w:pStyle w:val="tablecopy"/>
                               </w:pPr>
                               <w:r>
-                                <w:t>[50]-[53]</w:t>
+                                <w:t>[</w:t>
+                              </w:r>
+                              <w:r>
+                                <w:t>4</w:t>
+                              </w:r>
+                              <w:r>
+                                <w:t>7</w:t>
+                              </w:r>
+                              <w:r>
+                                <w:t>]-[5</w:t>
+                              </w:r>
+                              <w:r>
+                                <w:t>0</w:t>
+                              </w:r>
+                              <w:r>
+                                <w:t>]</w:t>
                               </w:r>
                             </w:p>
                           </w:tc>
@@ -1943,7 +2119,35 @@
                                   <w:sz w:val="16"/>
                                   <w:szCs w:val="16"/>
                                 </w:rPr>
-                                <w:t>[54]-[75]</w:t>
+                                <w:t>[5</w:t>
+                              </w:r>
+                              <w:r>
+                                <w:rPr>
+                                  <w:sz w:val="16"/>
+                                  <w:szCs w:val="16"/>
+                                </w:rPr>
+                                <w:t>1</w:t>
+                              </w:r>
+                              <w:r>
+                                <w:rPr>
+                                  <w:sz w:val="16"/>
+                                  <w:szCs w:val="16"/>
+                                </w:rPr>
+                                <w:t>]-[7</w:t>
+                              </w:r>
+                              <w:r>
+                                <w:rPr>
+                                  <w:sz w:val="16"/>
+                                  <w:szCs w:val="16"/>
+                                </w:rPr>
+                                <w:t>2</w:t>
+                              </w:r>
+                              <w:r>
+                                <w:rPr>
+                                  <w:sz w:val="16"/>
+                                  <w:szCs w:val="16"/>
+                                </w:rPr>
+                                <w:t>]</w:t>
                               </w:r>
                             </w:p>
                           </w:tc>
@@ -2085,15 +2289,7 @@
         </w:drawing>
       </w:r>
       <w:r>
-        <w:t xml:space="preserve">Avoid combining SI and CGS units, such as current in amperes and magnetic field in </w:t>
-      </w:r>
-      <w:proofErr w:type="spellStart"/>
-      <w:r>
-        <w:t>oersteds</w:t>
-      </w:r>
-      <w:proofErr w:type="spellEnd"/>
-      <w:r>
-        <w:t>. This often leads to confusion because equations do not balance dimensionally. If you must use mixed units, clearly state the units for each quantity that you use in an equation.</w:t>
+        <w:t>Avoid combining SI and CGS units, such as current in amperes and magnetic field in oersteds. This often leads to confusion because equations do not balance dimensionally. If you must use mixed units, clearly state the units for each quantity that you use in an equation.</w:t>
       </w:r>
     </w:p>
     <w:p>
@@ -2101,31 +2297,7 @@
         <w:pStyle w:val="bulletlist"/>
       </w:pPr>
       <w:r>
-        <w:t>Do not mix complete spellings and abbreviations of units: “Wb/m2” or “</w:t>
-      </w:r>
-      <w:proofErr w:type="spellStart"/>
-      <w:r>
-        <w:t>webers</w:t>
-      </w:r>
-      <w:proofErr w:type="spellEnd"/>
-      <w:r>
-        <w:t xml:space="preserve"> per square meter”, not “</w:t>
-      </w:r>
-      <w:proofErr w:type="spellStart"/>
-      <w:r>
-        <w:t>webers</w:t>
-      </w:r>
-      <w:proofErr w:type="spellEnd"/>
-      <w:r>
-        <w:t xml:space="preserve">/m2”.  Spell out units when they appear in text: “. . . a few </w:t>
-      </w:r>
-      <w:proofErr w:type="spellStart"/>
-      <w:r>
-        <w:t>henries</w:t>
-      </w:r>
-      <w:proofErr w:type="spellEnd"/>
-      <w:r>
-        <w:t>”, not “. . . a few H”.</w:t>
+        <w:t>Do not mix complete spellings and abbreviations of units: “Wb/m2” or “webers per square meter”, not “webers/m2”.  Spell out units when they appear in text: “. . . a few henries”, not “. . . a few H”.</w:t>
       </w:r>
     </w:p>
     <w:p>
@@ -2388,6 +2560,7 @@
         <w:pStyle w:val="bulletlist"/>
       </w:pPr>
       <w:r>
+        <w:lastRenderedPageBreak/>
         <w:t>Do not confuse “imply” and “infer”.</w:t>
       </w:r>
     </w:p>
@@ -2538,11 +2711,7 @@
         <w:t xml:space="preserve"> </w:t>
       </w:r>
       <w:r>
-        <w:t xml:space="preserve">Please keep your affiliations as </w:t>
-      </w:r>
-      <w:r>
-        <w:lastRenderedPageBreak/>
-        <w:t>succinct as possible (for example, do not differentiate among departments of the same organization).</w:t>
+        <w:t>Please keep your affiliations as succinct as possible (for example, do not differentiate among departments of the same organization).</w:t>
       </w:r>
     </w:p>
     <w:p>
@@ -2696,7 +2865,10 @@
         <w:pStyle w:val="BodyText"/>
       </w:pPr>
       <w:r>
-        <w:t>Text heads organize the topics on a relational, hierarchical basis. For example, the paper title is the primary text head because all subsequent material relates and elaborates on this one topic. If there are two or more sub-topics, the next level head (uppercase Roman numerals) should be used and, conversely, if there are not at least two sub-topics, then no subheads should be introduced. Styles named “Heading 1”, “Heading 2”, “Heading 3”, and “Heading 4” are prescribed.</w:t>
+        <w:t xml:space="preserve">Text heads organize the topics on a relational, hierarchical basis. For example, the paper title is the primary text head because all subsequent material relates and elaborates on this one topic. If there are two or more sub-topics, the next level </w:t>
+      </w:r>
+      <w:r>
+        <w:t>head (uppercase Roman numerals) should be used and, conversely, if there are not at least two sub-topics, then no subheads should be introduced. Styles named “Heading 1”, “Heading 2”, “Heading 3”, and “Heading 4” are prescribed.</w:t>
       </w:r>
     </w:p>
     <w:p>
@@ -3004,10 +3176,7 @@
         <w:pStyle w:val="BodyText"/>
       </w:pPr>
       <w:r>
-        <w:t xml:space="preserve">Figure Labels: Use 8 point Times New Roman for Figure labels. Use words rather than symbols or abbreviations when writing Figure axis labels to avoid confusing the reader. As an example, write the quantity “Magnetization”, or “Magnetization, M”, not just “M”. If including units in the label, present them within parentheses. Do not label axes only with units. In the example, write “Magnetization (A/m)” or </w:t>
-      </w:r>
-      <w:r>
-        <w:t>“Magnetization {A[m(1)]}”, not just “A/m”. Do not label axes</w:t>
+        <w:t>Figure Labels: Use 8 point Times New Roman for Figure labels. Use words rather than symbols or abbreviations when writing Figure axis labels to avoid confusing the reader. As an example, write the quantity “Magnetization”, or “Magnetization, M”, not just “M”. If including units in the label, present them within parentheses. Do not label axes only with units. In the example, write “Magnetization (A/m)” or “Magnetization {A[m(1)]}”, not just “A/m”. Do not label axes</w:t>
       </w:r>
       <w:r>
         <w:t xml:space="preserve"> </w:t>
@@ -3059,7 +3228,6 @@
       <w:r>
         <w:t>”. Avoid the stilted expression “</w:t>
       </w:r>
-      <w:proofErr w:type="spellStart"/>
       <w:r>
         <w:rPr>
           <w:lang w:val="en-US"/>
@@ -3067,11 +3235,7 @@
         <w:t>o</w:t>
       </w:r>
       <w:r>
-        <w:t>ne</w:t>
-      </w:r>
-      <w:proofErr w:type="spellEnd"/>
-      <w:r>
-        <w:t xml:space="preserve"> of us (R. B. G.) thanks </w:t>
+        <w:t xml:space="preserve">ne of us (R. B. G.) thanks </w:t>
       </w:r>
       <w:r>
         <w:t>...</w:t>
@@ -3193,6 +3357,7 @@
         <w:ind w:start="17.70pt" w:hanging="17.70pt"/>
       </w:pPr>
       <w:r>
+        <w:lastRenderedPageBreak/>
         <w:t>Kingma, Diederik P., and Max Welling. “An Introduction to Variational Autoencoders.” Foundations and Trends® in Machine Learning 12, no. 4 (2019): 307–92. https://doi.org/10.1561/2200000056.</w:t>
       </w:r>
     </w:p>
@@ -3220,16 +3385,7 @@
         <w:ind w:start="17.70pt" w:hanging="17.70pt"/>
       </w:pPr>
       <w:r>
-        <w:t>Vahdat, Arash, and Jan Kautz. “NVAE: A Deep Hierarchical Variational Autoencoder.” In Advances in Neural Information Processing Systems, edited by H. Larochelle, M. Ranzato, R. Hadsell, M. F. Balcan, and H. Lin, vol. 33. Curran Associates, Inc., 2020. https://proceedings.neurips.cc/paper_files/paper/2020/file/e3b21256183cf7c2c7a66be163579d37-Paper.pdf.</w:t>
-      </w:r>
-    </w:p>
-    <w:p>
-      <w:pPr>
-        <w:pStyle w:val="references"/>
-        <w:ind w:start="17.70pt" w:hanging="17.70pt"/>
-      </w:pPr>
-      <w:r>
-        <w:t>Zhao, Guangwei, and Yaxin Peng. “Semisupervised SAR Image Change Detection Based on a Siamese Variational Autoencoder.” Information Processing &amp; Management 59, no. 1 (2022): 102726. https://doi.org/10.1016/j.ipm.2021.102726.</w:t>
+        <w:t>Vahdat, Arash, and Jan Kautz. “NVAE: A Deep Hierarchical Variational Autoencoder.” In Advances in Neural Information Processing Systems, edited by H. Larochelle, M. Ranzato, R. Hadsell, M. F. Balcan, and H. Lin, vol. 33. Curran Associates, Inc., 2020.</w:t>
       </w:r>
     </w:p>
     <w:p>
@@ -3270,20 +3426,6 @@
       </w:pPr>
       <w:r>
         <w:t>Li, Bowen, Xiaojuan Qi, Thomas Lukasiewicz, and Philip Torr. “Controllable Text-to-Image Generation.” Advances in Neural Information Processing Systems 32 (2019).</w:t>
-      </w:r>
-    </w:p>
-    <w:p>
-      <w:pPr>
-        <w:pStyle w:val="references"/>
-        <w:autoSpaceDE w:val="0"/>
-        <w:autoSpaceDN w:val="0"/>
-        <w:adjustRightInd w:val="0"/>
-        <w:ind w:start="17.70pt" w:hanging="17.70pt"/>
-        <w:jc w:val="start"/>
-      </w:pPr>
-      <w:r>
-        <w:lastRenderedPageBreak/>
-        <w:t>Liu, Ming-Yu, Xun Huang, Jiahui Yu, Ting-Chun Wang, and Arun Mallya. “Generative Adversarial Networks for Image and Video Synthesis: Algorithms and Applications.” Proceedings of the IEEE 109, no. 5 (2021): 839–62. https://doi.org/10.1109/JPROC.2021.3049196.</w:t>
       </w:r>
     </w:p>
     <w:p>
@@ -3357,19 +3499,6 @@
         <w:jc w:val="start"/>
       </w:pPr>
       <w:r>
-        <w:t>Sankaranarayanan, Swami, Yogesh Balaji, Carlos D. Castillo, and Rama Chellappa. “Generate to Adapt: Aligning Domains Using Generative Adversarial Networks.” 2018, 8503–12.</w:t>
-      </w:r>
-    </w:p>
-    <w:p>
-      <w:pPr>
-        <w:pStyle w:val="references"/>
-        <w:autoSpaceDE w:val="0"/>
-        <w:autoSpaceDN w:val="0"/>
-        <w:adjustRightInd w:val="0"/>
-        <w:ind w:start="17.70pt" w:hanging="17.70pt"/>
-        <w:jc w:val="start"/>
-      </w:pPr>
-      <w:r>
         <w:t>Schonfeld, Edgar, Bernt Schiele, and Anna Khoreva. “A U-Net Based Discriminator for Generative Adversarial Networks.” 2020, 8207–16.</w:t>
       </w:r>
     </w:p>
@@ -3930,7 +4059,11 @@
         <w:jc w:val="start"/>
       </w:pPr>
       <w:r>
-        <w:t xml:space="preserve">Ramesh, Aditya, Prafulla Dhariwal, Alex Nichol, Casey Chu, and Mark Chen. “Hierarchical Text-Conditional Image Generation with CLIP Latents.” arXiv:2204.06125. Version 1. Preprint, arXiv, April 13, 2022. </w:t>
+        <w:t xml:space="preserve">Ramesh, Aditya, Prafulla Dhariwal, Alex Nichol, Casey Chu, and Mark Chen. “Hierarchical Text-Conditional Image Generation with </w:t>
+      </w:r>
+      <w:r>
+        <w:lastRenderedPageBreak/>
+        <w:t xml:space="preserve">CLIP Latents.” arXiv:2204.06125. Version 1. Preprint, arXiv, April 13, 2022. </w:t>
       </w:r>
       <w:hyperlink r:id="rId27" w:history="1">
         <w:r>
@@ -4052,7 +4185,6 @@
         <w:jc w:val="start"/>
       </w:pPr>
       <w:r>
-        <w:lastRenderedPageBreak/>
         <w:t>Arjovsky, Martin, Soumith Chintala, and Léon Bottou. “Wasserstein Generative Adversarial Networks.” Proceedings of the 34th International Conference on Machine Learning, PMLR, July 17, 2017, 214–23.</w:t>
       </w:r>
     </w:p>
@@ -4398,6 +4530,7 @@
         <w:rPr>
           <w:noProof/>
         </w:rPr>
+        <w:lastRenderedPageBreak/>
         <w:drawing>
           <wp:anchor distT="0" distB="0" distL="114300" distR="114300" simplePos="0" relativeHeight="251657728" behindDoc="1" locked="0" layoutInCell="1" allowOverlap="1" wp14:anchorId="50A5432F" wp14:editId="1BA04B32">
             <wp:simplePos x="0" y="0"/>
@@ -5435,7 +5568,7 @@
   <w:abstractNum w:abstractNumId="16" w15:restartNumberingAfterBreak="0">
     <w:nsid w:val="4189603E"/>
     <w:multiLevelType w:val="multilevel"/>
-    <w:tmpl w:val="0AB06E12"/>
+    <w:tmpl w:val="458C5766"/>
     <w:lvl w:ilvl="0">
       <w:start w:val="1"/>
       <w:numFmt w:val="upperRoman"/>
@@ -5494,6 +5627,7 @@
         <w:sz w:val="20"/>
         <w:szCs w:val="20"/>
         <w:vertAlign w:val="baseline"/>
+        <w:lang w:val="x-none"/>
         <w14:shadow w14:blurRad="0" w14:dist="0" w14:dir="0" w14:sx="0" w14:sy="0" w14:kx="0" w14:ky="0" w14:algn="none">
           <w14:srgbClr w14:val="000000"/>
         </w14:shadow>

</xml_diff>